<commit_message>
docs: finalize deployment documentation team contributions and release notes
</commit_message>
<xml_diff>
--- a/docs/Project_Report.docx
+++ b/docs/Project_Report.docx
@@ -58,17 +58,51 @@
     </w:p>
     <w:p>
       <w:r>
-        <w:t>Arun Jain — Backend Development, MongoDB Integration, API Development, Frontend–Backend Integration</w:t>
+        <w:t>Arun Kumar Jain — Backend Developer &amp; Integration Engineer</w:t>
       </w:r>
     </w:p>
     <w:p>
       <w:r>
-        <w:t>Ansh — React Frontend Development and UI</w:t>
+        <w:t>Ansh — Frontend Developer</w:t>
       </w:r>
     </w:p>
     <w:p>
       <w:r>
-        <w:t>Jheel — Documentation, Report, PPT, Project Packaging</w:t>
+        <w:t>Jheel — Documentation &amp; Project Delivery</w:t>
+      </w:r>
+    </w:p>
+    <w:p>
+      <w:r>
+        <w:rPr>
+          <w:b/>
+        </w:rPr>
+        <w:t>Contributions:</w:t>
+      </w:r>
+    </w:p>
+    <w:p>
+      <w:r>
+        <w:t>Arun Kumar Jain — Node.js + Express backend; MongoDB integration; CRUD, search, filter and pagination APIs; backend testing; frontend–backend integration; deployment support; final integration and release.</w:t>
+      </w:r>
+    </w:p>
+    <w:p>
+      <w:r>
+        <w:t>Ansh — React frontend and UI design; forms and validation; movie/book cards; Edit/Delete UI; search and filter interface; frontend bug fixes; frontend deployment support.</w:t>
+      </w:r>
+    </w:p>
+    <w:p>
+      <w:r>
+        <w:t>Jheel — project report; PPT preparation; architecture diagrams; screenshots organization; README preparation; final and deployment documentation; submission package.</w:t>
+      </w:r>
+    </w:p>
+    <w:p>
+      <w:r>
+        <w:rPr>
+          <w:b/>
+        </w:rPr>
+        <w:t>Live deployment:</w:t>
+      </w:r>
+      <w:r>
+        <w:t xml:space="preserve"> frontend https://movie-book-library-1.onrender.com (Render Static Site) · backend https://movie-book-library-ii96.onrender.com (Render Web Service) · MongoDB Atlas.</w:t>
       </w:r>
     </w:p>
     <w:p>
@@ -118,7 +152,7 @@
         <w:rPr>
           <w:b/>
         </w:rPr>
-        <w:t>Arun Jain, Ansh and Jheel</w:t>
+        <w:t>Arun Kumar Jain, Ansh and Jheel</w:t>
       </w:r>
       <w:r>
         <w:t xml:space="preserve"> in partial fulfilment of the requirements for the internship program at </w:t>
@@ -169,7 +203,7 @@
     </w:p>
     <w:p>
       <w:r>
-        <w:t>Arun Jain designed and implemented the backend, the MongoDB Atlas integration, the REST APIs and the frontend–backend integration. Ansh designed and implemented the React frontend and the complete UI. Jheel produced the documentation, this report, the presentation and the final project packaging. We also acknowledge the open documentation of React, Vite, Express, Mongoose and MongoDB, and the VS Code and MongoDB Compass tools used during testing.</w:t>
+        <w:t>Arun Kumar Jain designed and implemented the backend, the MongoDB Atlas integration, the REST APIs and the frontend–backend integration. Ansh designed and implemented the React frontend and the complete UI. Jheel produced the documentation, this report, the presentation and the final project packaging. We also acknowledge the open documentation of React, Vite, Express, Mongoose and MongoDB, and the VS Code and MongoDB Compass tools used during testing.</w:t>
       </w:r>
     </w:p>
     <w:p>
@@ -183,12 +217,12 @@
     </w:p>
     <w:p>
       <w:r>
-        <w:t>We, Arun Jain, Ansh and Jheel, hereby declare that the project entitled "Movie Book Library" submitted for internship evaluation at Naviotech Solution Pvt Ltd is an original work carried out by our team. All features, code, test results and screenshots presented in this report are from the actual implemented project. No feature has been invented for this report, and third-party content is limited to the open-source libraries listed in the Technology Stack section.</w:t>
+        <w:t>We, Arun Kumar Jain, Ansh and Jheel, hereby declare that the project entitled "Movie Book Library" submitted for internship evaluation at Naviotech Solution Pvt Ltd is an original work carried out by our team. All features, code, test results and screenshots presented in this report are from the actual implemented project. No feature has been invented for this report, and third-party content is limited to the open-source libraries listed in the Technology Stack section.</w:t>
       </w:r>
     </w:p>
     <w:p>
       <w:r>
-        <w:t>Arun Jain: ______________  Ansh: ______________  Jheel: ______________  Date: ______________</w:t>
+        <w:t>Arun Kumar Jain: ______________  Ansh: ______________  Jheel: ______________  Date: ______________</w:t>
       </w:r>
     </w:p>
     <w:p>
@@ -202,7 +236,7 @@
     </w:p>
     <w:p>
       <w:r>
-        <w:t>The Movie Book Library is a full-stack web application for managing a personal collection of movies and books. The frontend is a React + Vite single-page application with a responsive dark card UI. The backend is a Node.js + Express REST API using Mongoose for validation, persisted in MongoDB Atlas (database movie, collection items). The system implements complete CRUD (add, view, edit, delete), case-insensitive search, genre/type/rating filters, newest/oldest/top-rated sorting and server-side pagination. A field-alias contract (runtime = runtimeOrPages, director = directorOrAuthor) lets the UI consume the API with no mapping layer, and a shared 1–5 rating scale runs from form input through validation to display. Verification included a clean production build, lint with zero errors, a 20-check live API suite against Atlas (all passing), manual UI testing and database confirmation in MongoDB Compass.</w:t>
+        <w:t>The Movie Book Library is a full-stack web application for managing a personal collection of movies and books. The frontend is a React + Vite single-page application with a responsive dark card UI. The backend is a Node.js + Express REST API using Mongoose for validation, persisted in MongoDB Atlas (database movie, collection items). The system implements complete CRUD (add, view, edit, delete), case-insensitive search, genre/type/rating filters, newest/oldest/top-rated sorting and server-side pagination. A field-alias contract (runtime = runtimeOrPages, director = directorOrAuthor) lets the UI consume the API with no mapping layer, and a shared 1–5 rating scale runs from form input through validation to display. Verification included a clean production build, lint with zero errors, a 20-check live API suite against Atlas (all passing), manual UI testing and database confirmation in MongoDB Compass. The release is deployed and live: frontend https://movie-book-library-1.onrender.com (Render Static Site) backed by https://movie-book-library-ii96.onrender.com (Render Web Service); see §24 Deployment and Release.</w:t>
       </w:r>
     </w:p>
     <w:p>
@@ -4984,7 +5018,7 @@
     </w:p>
     <w:p>
       <w:r>
-        <w:t>All thirteen implemented features work end to end against MongoDB Atlas. Writes are validated and aliased in both directions; reads return a stable paginated envelope; the UI covers loading, error-with-retry, empty and no-results states. Quantitatively: 5 REST endpoints, 7 query parameters, 4 cards per page, 20/20 live API checks passing, 0 lint errors, 9 curated screenshots proving each claim.</w:t>
+        <w:t>All thirteen implemented features work end to end against MongoDB Atlas, and the release is live in production (frontend https://movie-book-library-1.onrender.com, backend https://movie-book-library-ii96.onrender.com). Writes are validated and aliased in both directions; reads return a stable paginated envelope; the UI covers loading, error-with-retry, empty and no-results states. Quantitatively: 5 REST endpoints, 7 query parameters, 4 cards per page, 20/20 live API checks passing, 0 lint errors, 9 curated screenshots proving each claim.</w:t>
       </w:r>
     </w:p>
     <w:p>
@@ -5012,7 +5046,7 @@
     </w:p>
     <w:p>
       <w:r>
-        <w:t>The Movie Book Library meets every objective in §8: complete CRUD, search, three filters, three sort orders, server-side pagination, a shared 1–5 rating scale, resilient UI states and Atlas persistence — delivered through a clean three-tier architecture with a zero-mapping UI↔API contract. The division of work (Arun: backend, database, APIs, integration; Ansh: frontend and UI; Jheel: documentation and packaging) produced an evaluation-ready, extensible full-stack application.</w:t>
+        <w:t>The Movie Book Library meets every objective in §8: complete CRUD, search, three filters, three sort orders, server-side pagination, a shared 1–5 rating scale, resilient UI states and Atlas persistence — delivered through a clean three-tier architecture with a zero-mapping UI↔API contract, and released live at https://movie-book-library-1.onrender.com. The division of work (Arun Kumar Jain: backend, database, APIs, integration and release; Ansh: frontend and UI; Jheel: documentation and packaging) produced an evaluation-ready, extensible full-stack application.</w:t>
       </w:r>
     </w:p>
     <w:p>
@@ -5021,7 +5055,269 @@
         <w:pageBreakBefore/>
       </w:pPr>
       <w:r>
-        <w:t>23. References</w:t>
+        <w:t>24. Deployment and Release</w:t>
+      </w:r>
+    </w:p>
+    <w:p>
+      <w:r>
+        <w:t>The final release is deployed on Render with MongoDB Atlas as the database; no code changes to CRUD logic, UI or schema were required for release.</w:t>
+      </w:r>
+    </w:p>
+    <w:tbl>
+      <w:tblPr>
+        <w:tblStyle w:val="TableGrid"/>
+        <w:tblW w:type="auto" w:w="0"/>
+        <w:tblLook w:firstColumn="1" w:firstRow="1" w:lastColumn="0" w:lastRow="0" w:noHBand="0" w:noVBand="1" w:val="04A0"/>
+      </w:tblPr>
+      <w:tblGrid>
+        <w:gridCol w:w="3120"/>
+        <w:gridCol w:w="3120"/>
+        <w:gridCol w:w="3120"/>
+      </w:tblGrid>
+      <w:tr>
+        <w:tc>
+          <w:tcPr>
+            <w:tcW w:type="dxa" w:w="3120"/>
+          </w:tcPr>
+          <w:p>
+            <w:r>
+              <w:rPr>
+                <w:b/>
+                <w:sz w:val="20"/>
+              </w:rPr>
+            </w:r>
+            <w:r>
+              <w:rPr>
+                <w:b/>
+                <w:sz w:val="20"/>
+              </w:rPr>
+              <w:t>Layer</w:t>
+            </w:r>
+          </w:p>
+        </w:tc>
+        <w:tc>
+          <w:tcPr>
+            <w:tcW w:type="dxa" w:w="3120"/>
+          </w:tcPr>
+          <w:p>
+            <w:r>
+              <w:rPr>
+                <w:b/>
+                <w:sz w:val="20"/>
+              </w:rPr>
+            </w:r>
+            <w:r>
+              <w:rPr>
+                <w:b/>
+                <w:sz w:val="20"/>
+              </w:rPr>
+              <w:t>Platform</w:t>
+            </w:r>
+          </w:p>
+        </w:tc>
+        <w:tc>
+          <w:tcPr>
+            <w:tcW w:type="dxa" w:w="3120"/>
+          </w:tcPr>
+          <w:p>
+            <w:r>
+              <w:rPr>
+                <w:b/>
+                <w:sz w:val="20"/>
+              </w:rPr>
+            </w:r>
+            <w:r>
+              <w:rPr>
+                <w:b/>
+                <w:sz w:val="20"/>
+              </w:rPr>
+              <w:t>URL</w:t>
+            </w:r>
+          </w:p>
+        </w:tc>
+      </w:tr>
+      <w:tr>
+        <w:tc>
+          <w:tcPr>
+            <w:tcW w:type="dxa" w:w="3120"/>
+          </w:tcPr>
+          <w:p>
+            <w:r>
+              <w:rPr>
+                <w:sz w:val="20"/>
+              </w:rPr>
+            </w:r>
+            <w:r>
+              <w:rPr>
+                <w:sz w:val="20"/>
+              </w:rPr>
+              <w:t>Frontend</w:t>
+            </w:r>
+          </w:p>
+        </w:tc>
+        <w:tc>
+          <w:tcPr>
+            <w:tcW w:type="dxa" w:w="3120"/>
+          </w:tcPr>
+          <w:p>
+            <w:r>
+              <w:rPr>
+                <w:sz w:val="20"/>
+              </w:rPr>
+            </w:r>
+            <w:r>
+              <w:rPr>
+                <w:sz w:val="20"/>
+              </w:rPr>
+              <w:t>Render Static Site (Vite production build)</w:t>
+            </w:r>
+          </w:p>
+        </w:tc>
+        <w:tc>
+          <w:tcPr>
+            <w:tcW w:type="dxa" w:w="3120"/>
+          </w:tcPr>
+          <w:p>
+            <w:r>
+              <w:rPr>
+                <w:sz w:val="20"/>
+              </w:rPr>
+            </w:r>
+            <w:r>
+              <w:rPr>
+                <w:sz w:val="20"/>
+              </w:rPr>
+              <w:t>https://movie-book-library-1.onrender.com</w:t>
+            </w:r>
+          </w:p>
+        </w:tc>
+      </w:tr>
+      <w:tr>
+        <w:tc>
+          <w:tcPr>
+            <w:tcW w:type="dxa" w:w="3120"/>
+          </w:tcPr>
+          <w:p>
+            <w:r>
+              <w:rPr>
+                <w:sz w:val="20"/>
+              </w:rPr>
+            </w:r>
+            <w:r>
+              <w:rPr>
+                <w:sz w:val="20"/>
+              </w:rPr>
+              <w:t>Backend</w:t>
+            </w:r>
+          </w:p>
+        </w:tc>
+        <w:tc>
+          <w:tcPr>
+            <w:tcW w:type="dxa" w:w="3120"/>
+          </w:tcPr>
+          <w:p>
+            <w:r>
+              <w:rPr>
+                <w:sz w:val="20"/>
+              </w:rPr>
+            </w:r>
+            <w:r>
+              <w:rPr>
+                <w:sz w:val="20"/>
+              </w:rPr>
+              <w:t>Render Web Service (Node + Express, npm start)</w:t>
+            </w:r>
+          </w:p>
+        </w:tc>
+        <w:tc>
+          <w:tcPr>
+            <w:tcW w:type="dxa" w:w="3120"/>
+          </w:tcPr>
+          <w:p>
+            <w:r>
+              <w:rPr>
+                <w:sz w:val="20"/>
+              </w:rPr>
+            </w:r>
+            <w:r>
+              <w:rPr>
+                <w:sz w:val="20"/>
+              </w:rPr>
+              <w:t>https://movie-book-library-ii96.onrender.com</w:t>
+            </w:r>
+          </w:p>
+        </w:tc>
+      </w:tr>
+      <w:tr>
+        <w:tc>
+          <w:tcPr>
+            <w:tcW w:type="dxa" w:w="3120"/>
+          </w:tcPr>
+          <w:p>
+            <w:r>
+              <w:rPr>
+                <w:sz w:val="20"/>
+              </w:rPr>
+            </w:r>
+            <w:r>
+              <w:rPr>
+                <w:sz w:val="20"/>
+              </w:rPr>
+              <w:t>Database</w:t>
+            </w:r>
+          </w:p>
+        </w:tc>
+        <w:tc>
+          <w:tcPr>
+            <w:tcW w:type="dxa" w:w="3120"/>
+          </w:tcPr>
+          <w:p>
+            <w:r>
+              <w:rPr>
+                <w:sz w:val="20"/>
+              </w:rPr>
+            </w:r>
+            <w:r>
+              <w:rPr>
+                <w:sz w:val="20"/>
+              </w:rPr>
+              <w:t>MongoDB Atlas</w:t>
+            </w:r>
+          </w:p>
+        </w:tc>
+        <w:tc>
+          <w:tcPr>
+            <w:tcW w:type="dxa" w:w="3120"/>
+          </w:tcPr>
+          <w:p>
+            <w:r>
+              <w:rPr>
+                <w:sz w:val="20"/>
+              </w:rPr>
+            </w:r>
+            <w:r>
+              <w:rPr>
+                <w:sz w:val="20"/>
+              </w:rPr>
+              <w:t>database movie, collection items</w:t>
+            </w:r>
+          </w:p>
+        </w:tc>
+      </w:tr>
+    </w:tbl>
+    <w:p/>
+    <w:p>
+      <w:r>
+        <w:t>Production workflow: the deployed frontend is built with VITE_API_URL=https://movie-book-library-ii96.onrender.com/api/items, so every search, filter, sort, page and CRUD action runs against production data; the API's open CORS policy accepts the static site without extra configuration, and PORT is injected by Render. Release verification: backend health endpoint returns {"success": true, "message": "Movie &amp; Book Library API is running"}; the frontend shell loads successfully; CRUD, search, filters, sorting and pagination were validated against the same Atlas cluster pre-release, with test documents removed afterwards.</w:t>
+      </w:r>
+    </w:p>
+    <w:p>
+      <w:pPr>
+        <w:pStyle w:val="Heading1"/>
+        <w:pageBreakBefore/>
+      </w:pPr>
+      <w:r>
+        <w:t>25. References</w:t>
       </w:r>
     </w:p>
     <w:p>

</xml_diff>